<commit_message>
Correccion de nombres y fecha del documento
</commit_message>
<xml_diff>
--- a/Documentacion/PLANTILLA_TRL1_V2 (1).docx
+++ b/Documentacion/PLANTILLA_TRL1_V2 (1).docx
@@ -1,6 +1,6 @@
 
 <file path=word/document.xml><?xml version="1.0" encoding="utf-8"?>
-<w:document xmlns:wpc="http://schemas.microsoft.com/office/word/2010/wordprocessingCanvas" xmlns:cx="http://schemas.microsoft.com/office/drawing/2014/chartex" xmlns:cx1="http://schemas.microsoft.com/office/drawing/2015/9/8/chartex" xmlns:cx2="http://schemas.microsoft.com/office/drawing/2015/10/21/chartex" xmlns:cx3="http://schemas.microsoft.com/office/drawing/2016/5/9/chartex" xmlns:cx4="http://schemas.microsoft.com/office/drawing/2016/5/10/chartex" xmlns:cx5="http://schemas.microsoft.com/office/drawing/2016/5/11/chartex" xmlns:cx6="http://schemas.microsoft.com/office/drawing/2016/5/12/chartex" xmlns:cx7="http://schemas.microsoft.com/office/drawing/2016/5/13/chartex" xmlns:cx8="http://schemas.microsoft.com/office/drawing/2016/5/14/chartex" xmlns:mc="http://schemas.openxmlformats.org/markup-compatibility/2006" xmlns:aink="http://schemas.microsoft.com/office/drawing/2016/ink" xmlns:am3d="http://schemas.microsoft.com/office/drawing/2017/model3d" xmlns:o="urn:schemas-microsoft-com:office:office" xmlns:r="http://schemas.openxmlformats.org/officeDocument/2006/relationships" xmlns:m="http://schemas.openxmlformats.org/officeDocument/2006/math" xmlns:v="urn:schemas-microsoft-com:vml" xmlns:wp14="http://schemas.microsoft.com/office/word/2010/wordprocessingDrawing" xmlns:wp="http://schemas.openxmlformats.org/drawingml/2006/wordprocessingDrawing" xmlns:w10="urn:schemas-microsoft-com:office:word" xmlns:w="http://schemas.openxmlformats.org/wordprocessingml/2006/main" xmlns:w14="http://schemas.microsoft.com/office/word/2010/wordml" xmlns:w15="http://schemas.microsoft.com/office/word/2012/wordml" xmlns:w16cex="http://schemas.microsoft.com/office/word/2018/wordml/cex" xmlns:w16cid="http://schemas.microsoft.com/office/word/2016/wordml/cid" xmlns:w16="http://schemas.microsoft.com/office/word/2018/wordml" xmlns:w16sdtdh="http://schemas.microsoft.com/office/word/2020/wordml/sdtdatahash" xmlns:w16se="http://schemas.microsoft.com/office/word/2015/wordml/symex" xmlns:wpg="http://schemas.microsoft.com/office/word/2010/wordprocessingGroup" xmlns:wpi="http://schemas.microsoft.com/office/word/2010/wordprocessingInk" xmlns:wne="http://schemas.microsoft.com/office/word/2006/wordml" xmlns:wps="http://schemas.microsoft.com/office/word/2010/wordprocessingShape" mc:Ignorable="w14 w15 w16se w16cid w16 w16cex w16sdtdh wp14">
+<w:document xmlns:wpc="http://schemas.microsoft.com/office/word/2010/wordprocessingCanvas" xmlns:cx="http://schemas.microsoft.com/office/drawing/2014/chartex" xmlns:cx1="http://schemas.microsoft.com/office/drawing/2015/9/8/chartex" xmlns:cx2="http://schemas.microsoft.com/office/drawing/2015/10/21/chartex" xmlns:cx3="http://schemas.microsoft.com/office/drawing/2016/5/9/chartex" xmlns:cx4="http://schemas.microsoft.com/office/drawing/2016/5/10/chartex" xmlns:cx5="http://schemas.microsoft.com/office/drawing/2016/5/11/chartex" xmlns:cx6="http://schemas.microsoft.com/office/drawing/2016/5/12/chartex" xmlns:cx7="http://schemas.microsoft.com/office/drawing/2016/5/13/chartex" xmlns:cx8="http://schemas.microsoft.com/office/drawing/2016/5/14/chartex" xmlns:mc="http://schemas.openxmlformats.org/markup-compatibility/2006" xmlns:aink="http://schemas.microsoft.com/office/drawing/2016/ink" xmlns:am3d="http://schemas.microsoft.com/office/drawing/2017/model3d" xmlns:o="urn:schemas-microsoft-com:office:office" xmlns:oel="http://schemas.microsoft.com/office/2019/extlst" xmlns:r="http://schemas.openxmlformats.org/officeDocument/2006/relationships" xmlns:m="http://schemas.openxmlformats.org/officeDocument/2006/math" xmlns:v="urn:schemas-microsoft-com:vml" xmlns:wp14="http://schemas.microsoft.com/office/word/2010/wordprocessingDrawing" xmlns:wp="http://schemas.openxmlformats.org/drawingml/2006/wordprocessingDrawing" xmlns:w10="urn:schemas-microsoft-com:office:word" xmlns:w="http://schemas.openxmlformats.org/wordprocessingml/2006/main" xmlns:w14="http://schemas.microsoft.com/office/word/2010/wordml" xmlns:w15="http://schemas.microsoft.com/office/word/2012/wordml" xmlns:w16cex="http://schemas.microsoft.com/office/word/2018/wordml/cex" xmlns:w16cid="http://schemas.microsoft.com/office/word/2016/wordml/cid" xmlns:w16="http://schemas.microsoft.com/office/word/2018/wordml" xmlns:w16sdtdh="http://schemas.microsoft.com/office/word/2020/wordml/sdtdatahash" xmlns:w16se="http://schemas.microsoft.com/office/word/2015/wordml/symex" xmlns:wpg="http://schemas.microsoft.com/office/word/2010/wordprocessingGroup" xmlns:wpi="http://schemas.microsoft.com/office/word/2010/wordprocessingInk" xmlns:wne="http://schemas.microsoft.com/office/word/2006/wordml" xmlns:wps="http://schemas.microsoft.com/office/word/2010/wordprocessingShape" mc:Ignorable="w14 w15 w16se w16cid w16 w16cex w16sdtdh wp14">
   <w:body>
     <w:p>
       <w:pPr>
@@ -222,7 +222,7 @@
           <w:sz w:val="28"/>
           <w:szCs w:val="28"/>
         </w:rPr>
-        <w:t>Lezama García Fernando</w:t>
+        <w:t>López Castro Rafael Uriel</w:t>
       </w:r>
     </w:p>
     <w:p>
@@ -245,7 +245,7 @@
           <w:sz w:val="28"/>
           <w:szCs w:val="28"/>
         </w:rPr>
-        <w:t>López Castro Rafael Uriel</w:t>
+        <w:t>Martínez Morales David</w:t>
       </w:r>
     </w:p>
     <w:p>
@@ -268,52 +268,6 @@
           <w:sz w:val="28"/>
           <w:szCs w:val="28"/>
         </w:rPr>
-        <w:t>Martínez Morales David</w:t>
-      </w:r>
-    </w:p>
-    <w:p>
-      <w:pPr>
-        <w:pStyle w:val="Prrafodelista"/>
-        <w:numPr>
-          <w:ilvl w:val="0"/>
-          <w:numId w:val="18"/>
-        </w:numPr>
-        <w:jc w:val="center"/>
-        <w:rPr>
-          <w:rFonts w:ascii="Montserrat" w:hAnsi="Montserrat"/>
-          <w:sz w:val="28"/>
-          <w:szCs w:val="28"/>
-        </w:rPr>
-      </w:pPr>
-      <w:r>
-        <w:rPr>
-          <w:rFonts w:ascii="Montserrat" w:hAnsi="Montserrat"/>
-          <w:sz w:val="28"/>
-          <w:szCs w:val="28"/>
-        </w:rPr>
-        <w:t>Morales Rivera Jerry</w:t>
-      </w:r>
-    </w:p>
-    <w:p>
-      <w:pPr>
-        <w:pStyle w:val="Prrafodelista"/>
-        <w:numPr>
-          <w:ilvl w:val="0"/>
-          <w:numId w:val="18"/>
-        </w:numPr>
-        <w:jc w:val="center"/>
-        <w:rPr>
-          <w:rFonts w:ascii="Montserrat" w:hAnsi="Montserrat"/>
-          <w:sz w:val="28"/>
-          <w:szCs w:val="28"/>
-        </w:rPr>
-      </w:pPr>
-      <w:r>
-        <w:rPr>
-          <w:rFonts w:ascii="Montserrat" w:hAnsi="Montserrat"/>
-          <w:sz w:val="28"/>
-          <w:szCs w:val="28"/>
-        </w:rPr>
         <w:t>Romero Cruz Emmanuel</w:t>
       </w:r>
     </w:p>
@@ -388,7 +342,7 @@
           <w:sz w:val="28"/>
           <w:szCs w:val="28"/>
         </w:rPr>
-        <w:t>TICO AI</w:t>
+        <w:t>TICO</w:t>
       </w:r>
     </w:p>
     <w:p>
@@ -458,7 +412,7 @@
           <w:sz w:val="28"/>
           <w:szCs w:val="28"/>
         </w:rPr>
-        <w:t>Septiembre</w:t>
+        <w:t>Junio</w:t>
       </w:r>
       <w:r>
         <w:rPr>
@@ -466,7 +420,15 @@
           <w:sz w:val="28"/>
           <w:szCs w:val="28"/>
         </w:rPr>
-        <w:t xml:space="preserve"> de 2024</w:t>
+        <w:t xml:space="preserve"> de 202</w:t>
+      </w:r>
+      <w:r>
+        <w:rPr>
+          <w:rFonts w:ascii="Montserrat" w:hAnsi="Montserrat"/>
+          <w:sz w:val="28"/>
+          <w:szCs w:val="28"/>
+        </w:rPr>
+        <w:t>6</w:t>
       </w:r>
     </w:p>
     <w:p>
@@ -2378,23 +2340,13 @@
           <w:szCs w:val="20"/>
         </w:rPr>
       </w:pPr>
-      <w:proofErr w:type="spellStart"/>
-      <w:r>
-        <w:rPr>
-          <w:rFonts w:ascii="Montserrat" w:hAnsi="Montserrat"/>
-          <w:sz w:val="20"/>
-          <w:szCs w:val="20"/>
-        </w:rPr>
-        <w:t>ChatBot</w:t>
-      </w:r>
-      <w:proofErr w:type="spellEnd"/>
-      <w:r>
-        <w:rPr>
-          <w:rFonts w:ascii="Montserrat" w:hAnsi="Montserrat"/>
-          <w:sz w:val="20"/>
-          <w:szCs w:val="20"/>
-        </w:rPr>
-        <w:t xml:space="preserve">: </w:t>
+      <w:r>
+        <w:rPr>
+          <w:rFonts w:ascii="Montserrat" w:hAnsi="Montserrat"/>
+          <w:sz w:val="20"/>
+          <w:szCs w:val="20"/>
+        </w:rPr>
+        <w:t xml:space="preserve">ChatBot: </w:t>
       </w:r>
       <w:r>
         <w:rPr>
@@ -2912,7 +2864,6 @@
         </w:rPr>
         <w:t xml:space="preserve">Se planea realizar utilizar el motor de desarrollo Unity para realizar el videojuego, el cual por medio de una API desarrollada en con </w:t>
       </w:r>
-      <w:proofErr w:type="spellStart"/>
       <w:r>
         <w:rPr>
           <w:rFonts w:ascii="Montserrat" w:hAnsi="Montserrat"/>
@@ -2927,34 +2878,7 @@
           <w:sz w:val="20"/>
           <w:szCs w:val="20"/>
         </w:rPr>
-        <w:t>odeJS</w:t>
-      </w:r>
-      <w:proofErr w:type="spellEnd"/>
-      <w:r>
-        <w:rPr>
-          <w:rFonts w:ascii="Montserrat" w:hAnsi="Montserrat"/>
-          <w:sz w:val="20"/>
-          <w:szCs w:val="20"/>
-        </w:rPr>
-        <w:t xml:space="preserve">, se conectara a la base de datos para almacenar la información, dicha información a su vez será visible en el panel administrativo desarrollado con </w:t>
-      </w:r>
-      <w:proofErr w:type="spellStart"/>
-      <w:r>
-        <w:rPr>
-          <w:rFonts w:ascii="Montserrat" w:hAnsi="Montserrat"/>
-          <w:sz w:val="20"/>
-          <w:szCs w:val="20"/>
-        </w:rPr>
-        <w:t>React</w:t>
-      </w:r>
-      <w:proofErr w:type="spellEnd"/>
-      <w:r>
-        <w:rPr>
-          <w:rFonts w:ascii="Montserrat" w:hAnsi="Montserrat"/>
-          <w:sz w:val="20"/>
-          <w:szCs w:val="20"/>
-        </w:rPr>
-        <w:t>, dando pie a una aplicación web, se plante el uso de una base de datos relacional en conjunto con una no relacional, para gestionar el volumen de información que se genera con los modelos de IA y el videojuego.</w:t>
+        <w:t>odeJS, se conectara a la base de datos para almacenar la información, dicha información a su vez será visible en el panel administrativo desarrollado con React, dando pie a una aplicación web, se plante el uso de una base de datos relacional en conjunto con una no relacional, para gestionar el volumen de información que se genera con los modelos de IA y el videojuego.</w:t>
       </w:r>
     </w:p>
     <w:p>
@@ -3086,6 +3010,7 @@
         <w:rPr>
           <w:rFonts w:ascii="Montserrat" w:hAnsi="Montserrat"/>
           <w:sz w:val="20"/>
+          <w:lang w:val="en-US"/>
         </w:rPr>
       </w:pPr>
       <w:r>
@@ -3110,12 +3035,23 @@
           <w:iCs/>
           <w:sz w:val="20"/>
         </w:rPr>
-        <w:t>Cienc. Soc.</w:t>
-      </w:r>
-      <w:r>
-        <w:rPr>
-          <w:rFonts w:ascii="Montserrat" w:hAnsi="Montserrat"/>
-          <w:sz w:val="20"/>
+        <w:t xml:space="preserve">Cienc. </w:t>
+      </w:r>
+      <w:r>
+        <w:rPr>
+          <w:rFonts w:ascii="Montserrat" w:hAnsi="Montserrat"/>
+          <w:i/>
+          <w:iCs/>
+          <w:sz w:val="20"/>
+          <w:lang w:val="en-US"/>
+        </w:rPr>
+        <w:t>Soc.</w:t>
+      </w:r>
+      <w:r>
+        <w:rPr>
+          <w:rFonts w:ascii="Montserrat" w:hAnsi="Montserrat"/>
+          <w:sz w:val="20"/>
+          <w:lang w:val="en-US"/>
         </w:rPr>
         <w:t>, vol. 46, n.</w:t>
       </w:r>
@@ -3124,6 +3060,7 @@
           <w:rFonts w:ascii="Montserrat" w:hAnsi="Montserrat"/>
           <w:sz w:val="20"/>
           <w:vertAlign w:val="superscript"/>
+          <w:lang w:val="en-US"/>
         </w:rPr>
         <w:t>o</w:t>
       </w:r>
@@ -3131,6 +3068,7 @@
         <w:rPr>
           <w:rFonts w:ascii="Montserrat" w:hAnsi="Montserrat"/>
           <w:sz w:val="20"/>
+          <w:lang w:val="en-US"/>
         </w:rPr>
         <w:t xml:space="preserve"> 4, pp. 69-85, dic. 2021, doi: 10.22206/cys.2021.v46i4.pp69-85.</w:t>
       </w:r>
@@ -3141,12 +3079,14 @@
         <w:rPr>
           <w:rFonts w:ascii="Montserrat" w:hAnsi="Montserrat"/>
           <w:sz w:val="20"/>
-        </w:rPr>
-      </w:pPr>
-      <w:r>
-        <w:rPr>
-          <w:rFonts w:ascii="Montserrat" w:hAnsi="Montserrat"/>
-          <w:sz w:val="20"/>
+          <w:lang w:val="en-US"/>
+        </w:rPr>
+      </w:pPr>
+      <w:r>
+        <w:rPr>
+          <w:rFonts w:ascii="Montserrat" w:hAnsi="Montserrat"/>
+          <w:sz w:val="20"/>
+          <w:lang w:val="en-US"/>
         </w:rPr>
         <w:t>[3]</w:t>
       </w:r>
@@ -3154,6 +3094,7 @@
         <w:rPr>
           <w:rFonts w:ascii="Montserrat" w:hAnsi="Montserrat"/>
           <w:sz w:val="20"/>
+          <w:lang w:val="en-US"/>
         </w:rPr>
         <w:tab/>
         <w:t xml:space="preserve">«[No title found]», </w:t>
@@ -3164,6 +3105,7 @@
           <w:i/>
           <w:iCs/>
           <w:sz w:val="20"/>
+          <w:lang w:val="en-US"/>
         </w:rPr>
         <w:t>Doc. Trab. Unicevantes</w:t>
       </w:r>
@@ -3171,6 +3113,7 @@
         <w:rPr>
           <w:rFonts w:ascii="Montserrat" w:hAnsi="Montserrat"/>
           <w:sz w:val="20"/>
+          <w:lang w:val="en-US"/>
         </w:rPr>
         <w:t>, vol. 1, n.</w:t>
       </w:r>
@@ -3179,6 +3122,7 @@
           <w:rFonts w:ascii="Montserrat" w:hAnsi="Montserrat"/>
           <w:sz w:val="20"/>
           <w:vertAlign w:val="superscript"/>
+          <w:lang w:val="en-US"/>
         </w:rPr>
         <w:t>o</w:t>
       </w:r>
@@ -3186,6 +3130,7 @@
         <w:rPr>
           <w:rFonts w:ascii="Montserrat" w:hAnsi="Montserrat"/>
           <w:sz w:val="20"/>
+          <w:lang w:val="en-US"/>
         </w:rPr>
         <w:t xml:space="preserve"> 1.</w:t>
       </w:r>
@@ -3196,12 +3141,14 @@
         <w:rPr>
           <w:rFonts w:ascii="Montserrat" w:hAnsi="Montserrat"/>
           <w:sz w:val="20"/>
-        </w:rPr>
-      </w:pPr>
-      <w:r>
-        <w:rPr>
-          <w:rFonts w:ascii="Montserrat" w:hAnsi="Montserrat"/>
-          <w:sz w:val="20"/>
+          <w:lang w:val="en-US"/>
+        </w:rPr>
+      </w:pPr>
+      <w:r>
+        <w:rPr>
+          <w:rFonts w:ascii="Montserrat" w:hAnsi="Montserrat"/>
+          <w:sz w:val="20"/>
+          <w:lang w:val="en-US"/>
         </w:rPr>
         <w:t>[4]</w:t>
       </w:r>
@@ -3209,6 +3156,7 @@
         <w:rPr>
           <w:rFonts w:ascii="Montserrat" w:hAnsi="Montserrat"/>
           <w:sz w:val="20"/>
+          <w:lang w:val="en-US"/>
         </w:rPr>
         <w:tab/>
         <w:t xml:space="preserve">S. S. Menon y K. Krishnamurthy, «Multimodal Ensemble Deep Learning to Predict Disruptive Behavior Disorders in Children», </w:t>
@@ -3219,6 +3167,7 @@
           <w:i/>
           <w:iCs/>
           <w:sz w:val="20"/>
+          <w:lang w:val="en-US"/>
         </w:rPr>
         <w:t>Front. Neuroinformatics</w:t>
       </w:r>
@@ -3226,6 +3175,7 @@
         <w:rPr>
           <w:rFonts w:ascii="Montserrat" w:hAnsi="Montserrat"/>
           <w:sz w:val="20"/>
+          <w:lang w:val="en-US"/>
         </w:rPr>
         <w:t>, vol. 15, nov. 2021, doi: 10.3389/fninf.2021.742807.</w:t>
       </w:r>
@@ -3242,6 +3192,7 @@
         <w:rPr>
           <w:rFonts w:ascii="Montserrat" w:hAnsi="Montserrat"/>
           <w:sz w:val="20"/>
+          <w:lang w:val="en-US"/>
         </w:rPr>
         <w:t>[5]</w:t>
       </w:r>
@@ -3249,9 +3200,17 @@
         <w:rPr>
           <w:rFonts w:ascii="Montserrat" w:hAnsi="Montserrat"/>
           <w:sz w:val="20"/>
+          <w:lang w:val="en-US"/>
         </w:rPr>
         <w:tab/>
-        <w:t>«Artificial Intelligence: A Modern Approach, 4th US ed.» Accedido: 11 de octubre de 2025. [En línea]. Disponible en: https://aima.cs.berkeley.edu/?utm_source=chatgpt.com</w:t>
+        <w:t xml:space="preserve">«Artificial Intelligence: A Modern Approach, 4th US ed.» </w:t>
+      </w:r>
+      <w:r>
+        <w:rPr>
+          <w:rFonts w:ascii="Montserrat" w:hAnsi="Montserrat"/>
+          <w:sz w:val="20"/>
+        </w:rPr>
+        <w:t>Accedido: 11 de octubre de 2025. [En línea]. Disponible en: https://aima.cs.berkeley.edu/?utm_source=chatgpt.com</w:t>
       </w:r>
     </w:p>
     <w:p>
@@ -3260,12 +3219,14 @@
         <w:rPr>
           <w:rFonts w:ascii="Montserrat" w:hAnsi="Montserrat"/>
           <w:sz w:val="20"/>
-        </w:rPr>
-      </w:pPr>
-      <w:r>
-        <w:rPr>
-          <w:rFonts w:ascii="Montserrat" w:hAnsi="Montserrat"/>
-          <w:sz w:val="20"/>
+          <w:lang w:val="en-US"/>
+        </w:rPr>
+      </w:pPr>
+      <w:r>
+        <w:rPr>
+          <w:rFonts w:ascii="Montserrat" w:hAnsi="Montserrat"/>
+          <w:sz w:val="20"/>
+          <w:lang w:val="en-US"/>
         </w:rPr>
         <w:t>[6]</w:t>
       </w:r>
@@ -3273,6 +3234,7 @@
         <w:rPr>
           <w:rFonts w:ascii="Montserrat" w:hAnsi="Montserrat"/>
           <w:sz w:val="20"/>
+          <w:lang w:val="en-US"/>
         </w:rPr>
         <w:tab/>
         <w:t xml:space="preserve">«(PDF) Chatbots: Are they Really Useful?», </w:t>
@@ -3283,6 +3245,7 @@
           <w:i/>
           <w:iCs/>
           <w:sz w:val="20"/>
+          <w:lang w:val="en-US"/>
         </w:rPr>
         <w:t>ResearchGate</w:t>
       </w:r>
@@ -3290,6 +3253,7 @@
         <w:rPr>
           <w:rFonts w:ascii="Montserrat" w:hAnsi="Montserrat"/>
           <w:sz w:val="20"/>
+          <w:lang w:val="en-US"/>
         </w:rPr>
         <w:t>, ago. 2025, doi: 10.21248/jlcl.22.2007.88.</w:t>
       </w:r>
@@ -3326,7 +3290,7 @@
 </file>
 
 <file path=word/endnotes.xml><?xml version="1.0" encoding="utf-8"?>
-<w:endnotes xmlns:wpc="http://schemas.microsoft.com/office/word/2010/wordprocessingCanvas" xmlns:cx="http://schemas.microsoft.com/office/drawing/2014/chartex" xmlns:cx1="http://schemas.microsoft.com/office/drawing/2015/9/8/chartex" xmlns:cx2="http://schemas.microsoft.com/office/drawing/2015/10/21/chartex" xmlns:cx3="http://schemas.microsoft.com/office/drawing/2016/5/9/chartex" xmlns:cx4="http://schemas.microsoft.com/office/drawing/2016/5/10/chartex" xmlns:cx5="http://schemas.microsoft.com/office/drawing/2016/5/11/chartex" xmlns:cx6="http://schemas.microsoft.com/office/drawing/2016/5/12/chartex" xmlns:cx7="http://schemas.microsoft.com/office/drawing/2016/5/13/chartex" xmlns:cx8="http://schemas.microsoft.com/office/drawing/2016/5/14/chartex" xmlns:mc="http://schemas.openxmlformats.org/markup-compatibility/2006" xmlns:aink="http://schemas.microsoft.com/office/drawing/2016/ink" xmlns:am3d="http://schemas.microsoft.com/office/drawing/2017/model3d" xmlns:o="urn:schemas-microsoft-com:office:office" xmlns:r="http://schemas.openxmlformats.org/officeDocument/2006/relationships" xmlns:m="http://schemas.openxmlformats.org/officeDocument/2006/math" xmlns:v="urn:schemas-microsoft-com:vml" xmlns:wp14="http://schemas.microsoft.com/office/word/2010/wordprocessingDrawing" xmlns:wp="http://schemas.openxmlformats.org/drawingml/2006/wordprocessingDrawing" xmlns:w10="urn:schemas-microsoft-com:office:word" xmlns:w="http://schemas.openxmlformats.org/wordprocessingml/2006/main" xmlns:w14="http://schemas.microsoft.com/office/word/2010/wordml" xmlns:w15="http://schemas.microsoft.com/office/word/2012/wordml" xmlns:w16cex="http://schemas.microsoft.com/office/word/2018/wordml/cex" xmlns:w16cid="http://schemas.microsoft.com/office/word/2016/wordml/cid" xmlns:w16="http://schemas.microsoft.com/office/word/2018/wordml" xmlns:w16sdtdh="http://schemas.microsoft.com/office/word/2020/wordml/sdtdatahash" xmlns:w16se="http://schemas.microsoft.com/office/word/2015/wordml/symex" xmlns:wpg="http://schemas.microsoft.com/office/word/2010/wordprocessingGroup" xmlns:wpi="http://schemas.microsoft.com/office/word/2010/wordprocessingInk" xmlns:wne="http://schemas.microsoft.com/office/word/2006/wordml" xmlns:wps="http://schemas.microsoft.com/office/word/2010/wordprocessingShape" mc:Ignorable="w14 w15 w16se w16cid w16 w16cex w16sdtdh wp14">
+<w:endnotes xmlns:wpc="http://schemas.microsoft.com/office/word/2010/wordprocessingCanvas" xmlns:cx="http://schemas.microsoft.com/office/drawing/2014/chartex" xmlns:cx1="http://schemas.microsoft.com/office/drawing/2015/9/8/chartex" xmlns:cx2="http://schemas.microsoft.com/office/drawing/2015/10/21/chartex" xmlns:cx3="http://schemas.microsoft.com/office/drawing/2016/5/9/chartex" xmlns:cx4="http://schemas.microsoft.com/office/drawing/2016/5/10/chartex" xmlns:cx5="http://schemas.microsoft.com/office/drawing/2016/5/11/chartex" xmlns:cx6="http://schemas.microsoft.com/office/drawing/2016/5/12/chartex" xmlns:cx7="http://schemas.microsoft.com/office/drawing/2016/5/13/chartex" xmlns:cx8="http://schemas.microsoft.com/office/drawing/2016/5/14/chartex" xmlns:mc="http://schemas.openxmlformats.org/markup-compatibility/2006" xmlns:aink="http://schemas.microsoft.com/office/drawing/2016/ink" xmlns:am3d="http://schemas.microsoft.com/office/drawing/2017/model3d" xmlns:o="urn:schemas-microsoft-com:office:office" xmlns:oel="http://schemas.microsoft.com/office/2019/extlst" xmlns:r="http://schemas.openxmlformats.org/officeDocument/2006/relationships" xmlns:m="http://schemas.openxmlformats.org/officeDocument/2006/math" xmlns:v="urn:schemas-microsoft-com:vml" xmlns:wp14="http://schemas.microsoft.com/office/word/2010/wordprocessingDrawing" xmlns:wp="http://schemas.openxmlformats.org/drawingml/2006/wordprocessingDrawing" xmlns:w10="urn:schemas-microsoft-com:office:word" xmlns:w="http://schemas.openxmlformats.org/wordprocessingml/2006/main" xmlns:w14="http://schemas.microsoft.com/office/word/2010/wordml" xmlns:w15="http://schemas.microsoft.com/office/word/2012/wordml" xmlns:w16cex="http://schemas.microsoft.com/office/word/2018/wordml/cex" xmlns:w16cid="http://schemas.microsoft.com/office/word/2016/wordml/cid" xmlns:w16="http://schemas.microsoft.com/office/word/2018/wordml" xmlns:w16sdtdh="http://schemas.microsoft.com/office/word/2020/wordml/sdtdatahash" xmlns:w16se="http://schemas.microsoft.com/office/word/2015/wordml/symex" xmlns:wpg="http://schemas.microsoft.com/office/word/2010/wordprocessingGroup" xmlns:wpi="http://schemas.microsoft.com/office/word/2010/wordprocessingInk" xmlns:wne="http://schemas.microsoft.com/office/word/2006/wordml" xmlns:wps="http://schemas.microsoft.com/office/word/2010/wordprocessingShape" mc:Ignorable="w14 w15 w16se w16cid w16 w16cex w16sdtdh wp14">
   <w:endnote w:type="separator" w:id="-1">
     <w:p>
       <w:pPr>
@@ -3351,7 +3315,7 @@
 </file>
 
 <file path=word/footnotes.xml><?xml version="1.0" encoding="utf-8"?>
-<w:footnotes xmlns:wpc="http://schemas.microsoft.com/office/word/2010/wordprocessingCanvas" xmlns:cx="http://schemas.microsoft.com/office/drawing/2014/chartex" xmlns:cx1="http://schemas.microsoft.com/office/drawing/2015/9/8/chartex" xmlns:cx2="http://schemas.microsoft.com/office/drawing/2015/10/21/chartex" xmlns:cx3="http://schemas.microsoft.com/office/drawing/2016/5/9/chartex" xmlns:cx4="http://schemas.microsoft.com/office/drawing/2016/5/10/chartex" xmlns:cx5="http://schemas.microsoft.com/office/drawing/2016/5/11/chartex" xmlns:cx6="http://schemas.microsoft.com/office/drawing/2016/5/12/chartex" xmlns:cx7="http://schemas.microsoft.com/office/drawing/2016/5/13/chartex" xmlns:cx8="http://schemas.microsoft.com/office/drawing/2016/5/14/chartex" xmlns:mc="http://schemas.openxmlformats.org/markup-compatibility/2006" xmlns:aink="http://schemas.microsoft.com/office/drawing/2016/ink" xmlns:am3d="http://schemas.microsoft.com/office/drawing/2017/model3d" xmlns:o="urn:schemas-microsoft-com:office:office" xmlns:r="http://schemas.openxmlformats.org/officeDocument/2006/relationships" xmlns:m="http://schemas.openxmlformats.org/officeDocument/2006/math" xmlns:v="urn:schemas-microsoft-com:vml" xmlns:wp14="http://schemas.microsoft.com/office/word/2010/wordprocessingDrawing" xmlns:wp="http://schemas.openxmlformats.org/drawingml/2006/wordprocessingDrawing" xmlns:w10="urn:schemas-microsoft-com:office:word" xmlns:w="http://schemas.openxmlformats.org/wordprocessingml/2006/main" xmlns:w14="http://schemas.microsoft.com/office/word/2010/wordml" xmlns:w15="http://schemas.microsoft.com/office/word/2012/wordml" xmlns:w16cex="http://schemas.microsoft.com/office/word/2018/wordml/cex" xmlns:w16cid="http://schemas.microsoft.com/office/word/2016/wordml/cid" xmlns:w16="http://schemas.microsoft.com/office/word/2018/wordml" xmlns:w16sdtdh="http://schemas.microsoft.com/office/word/2020/wordml/sdtdatahash" xmlns:w16se="http://schemas.microsoft.com/office/word/2015/wordml/symex" xmlns:wpg="http://schemas.microsoft.com/office/word/2010/wordprocessingGroup" xmlns:wpi="http://schemas.microsoft.com/office/word/2010/wordprocessingInk" xmlns:wne="http://schemas.microsoft.com/office/word/2006/wordml" xmlns:wps="http://schemas.microsoft.com/office/word/2010/wordprocessingShape" mc:Ignorable="w14 w15 w16se w16cid w16 w16cex w16sdtdh wp14">
+<w:footnotes xmlns:wpc="http://schemas.microsoft.com/office/word/2010/wordprocessingCanvas" xmlns:cx="http://schemas.microsoft.com/office/drawing/2014/chartex" xmlns:cx1="http://schemas.microsoft.com/office/drawing/2015/9/8/chartex" xmlns:cx2="http://schemas.microsoft.com/office/drawing/2015/10/21/chartex" xmlns:cx3="http://schemas.microsoft.com/office/drawing/2016/5/9/chartex" xmlns:cx4="http://schemas.microsoft.com/office/drawing/2016/5/10/chartex" xmlns:cx5="http://schemas.microsoft.com/office/drawing/2016/5/11/chartex" xmlns:cx6="http://schemas.microsoft.com/office/drawing/2016/5/12/chartex" xmlns:cx7="http://schemas.microsoft.com/office/drawing/2016/5/13/chartex" xmlns:cx8="http://schemas.microsoft.com/office/drawing/2016/5/14/chartex" xmlns:mc="http://schemas.openxmlformats.org/markup-compatibility/2006" xmlns:aink="http://schemas.microsoft.com/office/drawing/2016/ink" xmlns:am3d="http://schemas.microsoft.com/office/drawing/2017/model3d" xmlns:o="urn:schemas-microsoft-com:office:office" xmlns:oel="http://schemas.microsoft.com/office/2019/extlst" xmlns:r="http://schemas.openxmlformats.org/officeDocument/2006/relationships" xmlns:m="http://schemas.openxmlformats.org/officeDocument/2006/math" xmlns:v="urn:schemas-microsoft-com:vml" xmlns:wp14="http://schemas.microsoft.com/office/word/2010/wordprocessingDrawing" xmlns:wp="http://schemas.openxmlformats.org/drawingml/2006/wordprocessingDrawing" xmlns:w10="urn:schemas-microsoft-com:office:word" xmlns:w="http://schemas.openxmlformats.org/wordprocessingml/2006/main" xmlns:w14="http://schemas.microsoft.com/office/word/2010/wordml" xmlns:w15="http://schemas.microsoft.com/office/word/2012/wordml" xmlns:w16cex="http://schemas.microsoft.com/office/word/2018/wordml/cex" xmlns:w16cid="http://schemas.microsoft.com/office/word/2016/wordml/cid" xmlns:w16="http://schemas.microsoft.com/office/word/2018/wordml" xmlns:w16sdtdh="http://schemas.microsoft.com/office/word/2020/wordml/sdtdatahash" xmlns:w16se="http://schemas.microsoft.com/office/word/2015/wordml/symex" xmlns:wpg="http://schemas.microsoft.com/office/word/2010/wordprocessingGroup" xmlns:wpi="http://schemas.microsoft.com/office/word/2010/wordprocessingInk" xmlns:wne="http://schemas.microsoft.com/office/word/2006/wordml" xmlns:wps="http://schemas.microsoft.com/office/word/2010/wordprocessingShape" mc:Ignorable="w14 w15 w16se w16cid w16 w16cex w16sdtdh wp14">
   <w:footnote w:type="separator" w:id="-1">
     <w:p>
       <w:pPr>
@@ -3376,7 +3340,7 @@
 </file>
 
 <file path=word/header1.xml><?xml version="1.0" encoding="utf-8"?>
-<w:hdr xmlns:wpc="http://schemas.microsoft.com/office/word/2010/wordprocessingCanvas" xmlns:cx="http://schemas.microsoft.com/office/drawing/2014/chartex" xmlns:cx1="http://schemas.microsoft.com/office/drawing/2015/9/8/chartex" xmlns:cx2="http://schemas.microsoft.com/office/drawing/2015/10/21/chartex" xmlns:cx3="http://schemas.microsoft.com/office/drawing/2016/5/9/chartex" xmlns:cx4="http://schemas.microsoft.com/office/drawing/2016/5/10/chartex" xmlns:cx5="http://schemas.microsoft.com/office/drawing/2016/5/11/chartex" xmlns:cx6="http://schemas.microsoft.com/office/drawing/2016/5/12/chartex" xmlns:cx7="http://schemas.microsoft.com/office/drawing/2016/5/13/chartex" xmlns:cx8="http://schemas.microsoft.com/office/drawing/2016/5/14/chartex" xmlns:mc="http://schemas.openxmlformats.org/markup-compatibility/2006" xmlns:aink="http://schemas.microsoft.com/office/drawing/2016/ink" xmlns:am3d="http://schemas.microsoft.com/office/drawing/2017/model3d" xmlns:o="urn:schemas-microsoft-com:office:office" xmlns:r="http://schemas.openxmlformats.org/officeDocument/2006/relationships" xmlns:m="http://schemas.openxmlformats.org/officeDocument/2006/math" xmlns:v="urn:schemas-microsoft-com:vml" xmlns:wp14="http://schemas.microsoft.com/office/word/2010/wordprocessingDrawing" xmlns:wp="http://schemas.openxmlformats.org/drawingml/2006/wordprocessingDrawing" xmlns:w10="urn:schemas-microsoft-com:office:word" xmlns:w="http://schemas.openxmlformats.org/wordprocessingml/2006/main" xmlns:w14="http://schemas.microsoft.com/office/word/2010/wordml" xmlns:w15="http://schemas.microsoft.com/office/word/2012/wordml" xmlns:w16cex="http://schemas.microsoft.com/office/word/2018/wordml/cex" xmlns:w16cid="http://schemas.microsoft.com/office/word/2016/wordml/cid" xmlns:w16="http://schemas.microsoft.com/office/word/2018/wordml" xmlns:w16sdtdh="http://schemas.microsoft.com/office/word/2020/wordml/sdtdatahash" xmlns:w16se="http://schemas.microsoft.com/office/word/2015/wordml/symex" xmlns:wpg="http://schemas.microsoft.com/office/word/2010/wordprocessingGroup" xmlns:wpi="http://schemas.microsoft.com/office/word/2010/wordprocessingInk" xmlns:wne="http://schemas.microsoft.com/office/word/2006/wordml" xmlns:wps="http://schemas.microsoft.com/office/word/2010/wordprocessingShape" mc:Ignorable="w14 w15 w16se w16cid w16 w16cex w16sdtdh wp14">
+<w:hdr xmlns:wpc="http://schemas.microsoft.com/office/word/2010/wordprocessingCanvas" xmlns:cx="http://schemas.microsoft.com/office/drawing/2014/chartex" xmlns:cx1="http://schemas.microsoft.com/office/drawing/2015/9/8/chartex" xmlns:cx2="http://schemas.microsoft.com/office/drawing/2015/10/21/chartex" xmlns:cx3="http://schemas.microsoft.com/office/drawing/2016/5/9/chartex" xmlns:cx4="http://schemas.microsoft.com/office/drawing/2016/5/10/chartex" xmlns:cx5="http://schemas.microsoft.com/office/drawing/2016/5/11/chartex" xmlns:cx6="http://schemas.microsoft.com/office/drawing/2016/5/12/chartex" xmlns:cx7="http://schemas.microsoft.com/office/drawing/2016/5/13/chartex" xmlns:cx8="http://schemas.microsoft.com/office/drawing/2016/5/14/chartex" xmlns:mc="http://schemas.openxmlformats.org/markup-compatibility/2006" xmlns:aink="http://schemas.microsoft.com/office/drawing/2016/ink" xmlns:am3d="http://schemas.microsoft.com/office/drawing/2017/model3d" xmlns:o="urn:schemas-microsoft-com:office:office" xmlns:oel="http://schemas.microsoft.com/office/2019/extlst" xmlns:r="http://schemas.openxmlformats.org/officeDocument/2006/relationships" xmlns:m="http://schemas.openxmlformats.org/officeDocument/2006/math" xmlns:v="urn:schemas-microsoft-com:vml" xmlns:wp14="http://schemas.microsoft.com/office/word/2010/wordprocessingDrawing" xmlns:wp="http://schemas.openxmlformats.org/drawingml/2006/wordprocessingDrawing" xmlns:w10="urn:schemas-microsoft-com:office:word" xmlns:w="http://schemas.openxmlformats.org/wordprocessingml/2006/main" xmlns:w14="http://schemas.microsoft.com/office/word/2010/wordml" xmlns:w15="http://schemas.microsoft.com/office/word/2012/wordml" xmlns:w16cex="http://schemas.microsoft.com/office/word/2018/wordml/cex" xmlns:w16cid="http://schemas.microsoft.com/office/word/2016/wordml/cid" xmlns:w16="http://schemas.microsoft.com/office/word/2018/wordml" xmlns:w16sdtdh="http://schemas.microsoft.com/office/word/2020/wordml/sdtdatahash" xmlns:w16se="http://schemas.microsoft.com/office/word/2015/wordml/symex" xmlns:wpg="http://schemas.microsoft.com/office/word/2010/wordprocessingGroup" xmlns:wpi="http://schemas.microsoft.com/office/word/2010/wordprocessingInk" xmlns:wne="http://schemas.microsoft.com/office/word/2006/wordml" xmlns:wps="http://schemas.microsoft.com/office/word/2010/wordprocessingShape" mc:Ignorable="w14 w15 w16se w16cid w16 w16cex w16sdtdh wp14">
   <w:p>
     <w:pPr>
       <w:pStyle w:val="Encabezado"/>
@@ -3482,7 +3446,7 @@
 </file>
 
 <file path=word/numbering.xml><?xml version="1.0" encoding="utf-8"?>
-<w:numbering xmlns:wpc="http://schemas.microsoft.com/office/word/2010/wordprocessingCanvas" xmlns:cx="http://schemas.microsoft.com/office/drawing/2014/chartex" xmlns:cx1="http://schemas.microsoft.com/office/drawing/2015/9/8/chartex" xmlns:cx2="http://schemas.microsoft.com/office/drawing/2015/10/21/chartex" xmlns:cx3="http://schemas.microsoft.com/office/drawing/2016/5/9/chartex" xmlns:cx4="http://schemas.microsoft.com/office/drawing/2016/5/10/chartex" xmlns:cx5="http://schemas.microsoft.com/office/drawing/2016/5/11/chartex" xmlns:cx6="http://schemas.microsoft.com/office/drawing/2016/5/12/chartex" xmlns:cx7="http://schemas.microsoft.com/office/drawing/2016/5/13/chartex" xmlns:cx8="http://schemas.microsoft.com/office/drawing/2016/5/14/chartex" xmlns:mc="http://schemas.openxmlformats.org/markup-compatibility/2006" xmlns:aink="http://schemas.microsoft.com/office/drawing/2016/ink" xmlns:am3d="http://schemas.microsoft.com/office/drawing/2017/model3d" xmlns:o="urn:schemas-microsoft-com:office:office" xmlns:r="http://schemas.openxmlformats.org/officeDocument/2006/relationships" xmlns:m="http://schemas.openxmlformats.org/officeDocument/2006/math" xmlns:v="urn:schemas-microsoft-com:vml" xmlns:wp14="http://schemas.microsoft.com/office/word/2010/wordprocessingDrawing" xmlns:wp="http://schemas.openxmlformats.org/drawingml/2006/wordprocessingDrawing" xmlns:w10="urn:schemas-microsoft-com:office:word" xmlns:w="http://schemas.openxmlformats.org/wordprocessingml/2006/main" xmlns:w14="http://schemas.microsoft.com/office/word/2010/wordml" xmlns:w15="http://schemas.microsoft.com/office/word/2012/wordml" xmlns:w16cex="http://schemas.microsoft.com/office/word/2018/wordml/cex" xmlns:w16cid="http://schemas.microsoft.com/office/word/2016/wordml/cid" xmlns:w16="http://schemas.microsoft.com/office/word/2018/wordml" xmlns:w16sdtdh="http://schemas.microsoft.com/office/word/2020/wordml/sdtdatahash" xmlns:w16se="http://schemas.microsoft.com/office/word/2015/wordml/symex" xmlns:wpg="http://schemas.microsoft.com/office/word/2010/wordprocessingGroup" xmlns:wpi="http://schemas.microsoft.com/office/word/2010/wordprocessingInk" xmlns:wne="http://schemas.microsoft.com/office/word/2006/wordml" xmlns:wps="http://schemas.microsoft.com/office/word/2010/wordprocessingShape" mc:Ignorable="w14 w15 w16se w16cid w16 w16cex w16sdtdh wp14">
+<w:numbering xmlns:wpc="http://schemas.microsoft.com/office/word/2010/wordprocessingCanvas" xmlns:cx="http://schemas.microsoft.com/office/drawing/2014/chartex" xmlns:cx1="http://schemas.microsoft.com/office/drawing/2015/9/8/chartex" xmlns:cx2="http://schemas.microsoft.com/office/drawing/2015/10/21/chartex" xmlns:cx3="http://schemas.microsoft.com/office/drawing/2016/5/9/chartex" xmlns:cx4="http://schemas.microsoft.com/office/drawing/2016/5/10/chartex" xmlns:cx5="http://schemas.microsoft.com/office/drawing/2016/5/11/chartex" xmlns:cx6="http://schemas.microsoft.com/office/drawing/2016/5/12/chartex" xmlns:cx7="http://schemas.microsoft.com/office/drawing/2016/5/13/chartex" xmlns:cx8="http://schemas.microsoft.com/office/drawing/2016/5/14/chartex" xmlns:mc="http://schemas.openxmlformats.org/markup-compatibility/2006" xmlns:aink="http://schemas.microsoft.com/office/drawing/2016/ink" xmlns:am3d="http://schemas.microsoft.com/office/drawing/2017/model3d" xmlns:o="urn:schemas-microsoft-com:office:office" xmlns:oel="http://schemas.microsoft.com/office/2019/extlst" xmlns:r="http://schemas.openxmlformats.org/officeDocument/2006/relationships" xmlns:m="http://schemas.openxmlformats.org/officeDocument/2006/math" xmlns:v="urn:schemas-microsoft-com:vml" xmlns:wp14="http://schemas.microsoft.com/office/word/2010/wordprocessingDrawing" xmlns:wp="http://schemas.openxmlformats.org/drawingml/2006/wordprocessingDrawing" xmlns:w10="urn:schemas-microsoft-com:office:word" xmlns:w="http://schemas.openxmlformats.org/wordprocessingml/2006/main" xmlns:w14="http://schemas.microsoft.com/office/word/2010/wordml" xmlns:w15="http://schemas.microsoft.com/office/word/2012/wordml" xmlns:w16cex="http://schemas.microsoft.com/office/word/2018/wordml/cex" xmlns:w16cid="http://schemas.microsoft.com/office/word/2016/wordml/cid" xmlns:w16="http://schemas.microsoft.com/office/word/2018/wordml" xmlns:w16sdtdh="http://schemas.microsoft.com/office/word/2020/wordml/sdtdatahash" xmlns:w16se="http://schemas.microsoft.com/office/word/2015/wordml/symex" xmlns:wpg="http://schemas.microsoft.com/office/word/2010/wordprocessingGroup" xmlns:wpi="http://schemas.microsoft.com/office/word/2010/wordprocessingInk" xmlns:wne="http://schemas.microsoft.com/office/word/2006/wordml" xmlns:wps="http://schemas.microsoft.com/office/word/2010/wordprocessingShape" mc:Ignorable="w14 w15 w16se w16cid w16 w16cex w16sdtdh wp14">
   <w:abstractNum w:abstractNumId="0" w15:restartNumberingAfterBreak="0">
     <w:nsid w:val="0522171F"/>
     <w:multiLevelType w:val="hybridMultilevel"/>
@@ -5076,58 +5040,58 @@
       </w:pPr>
     </w:lvl>
   </w:abstractNum>
-  <w:num w:numId="1">
+  <w:num w:numId="1" w16cid:durableId="1595092738">
     <w:abstractNumId w:val="12"/>
   </w:num>
-  <w:num w:numId="2">
+  <w:num w:numId="2" w16cid:durableId="1539270409">
     <w:abstractNumId w:val="9"/>
   </w:num>
-  <w:num w:numId="3">
+  <w:num w:numId="3" w16cid:durableId="1772434182">
     <w:abstractNumId w:val="10"/>
   </w:num>
-  <w:num w:numId="4">
+  <w:num w:numId="4" w16cid:durableId="236936562">
     <w:abstractNumId w:val="2"/>
   </w:num>
-  <w:num w:numId="5">
+  <w:num w:numId="5" w16cid:durableId="1741367561">
     <w:abstractNumId w:val="1"/>
   </w:num>
-  <w:num w:numId="6">
+  <w:num w:numId="6" w16cid:durableId="1509827111">
     <w:abstractNumId w:val="8"/>
   </w:num>
-  <w:num w:numId="7">
+  <w:num w:numId="7" w16cid:durableId="1629050470">
     <w:abstractNumId w:val="0"/>
   </w:num>
-  <w:num w:numId="8">
+  <w:num w:numId="8" w16cid:durableId="351231027">
     <w:abstractNumId w:val="4"/>
   </w:num>
-  <w:num w:numId="9">
+  <w:num w:numId="9" w16cid:durableId="233975015">
     <w:abstractNumId w:val="15"/>
   </w:num>
-  <w:num w:numId="10">
+  <w:num w:numId="10" w16cid:durableId="1462379707">
     <w:abstractNumId w:val="5"/>
   </w:num>
-  <w:num w:numId="11">
+  <w:num w:numId="11" w16cid:durableId="1407915526">
     <w:abstractNumId w:val="6"/>
   </w:num>
-  <w:num w:numId="12">
+  <w:num w:numId="12" w16cid:durableId="585115219">
     <w:abstractNumId w:val="13"/>
   </w:num>
-  <w:num w:numId="13">
+  <w:num w:numId="13" w16cid:durableId="787358129">
     <w:abstractNumId w:val="14"/>
   </w:num>
-  <w:num w:numId="14">
+  <w:num w:numId="14" w16cid:durableId="915749130">
     <w:abstractNumId w:val="3"/>
   </w:num>
-  <w:num w:numId="15">
+  <w:num w:numId="15" w16cid:durableId="1652438918">
     <w:abstractNumId w:val="16"/>
   </w:num>
-  <w:num w:numId="16">
+  <w:num w:numId="16" w16cid:durableId="914171731">
     <w:abstractNumId w:val="7"/>
   </w:num>
-  <w:num w:numId="17">
+  <w:num w:numId="17" w16cid:durableId="1762023685">
     <w:abstractNumId w:val="17"/>
   </w:num>
-  <w:num w:numId="18">
+  <w:num w:numId="18" w16cid:durableId="1595283884">
     <w:abstractNumId w:val="11"/>
   </w:num>
 </w:numbering>

</xml_diff>

<commit_message>
Fix: Correcion en portada de la plantilla del TRL1
</commit_message>
<xml_diff>
--- a/Documentacion/PLANTILLA_TRL1_V2 (1).docx
+++ b/Documentacion/PLANTILLA_TRL1_V2 (1).docx
@@ -19,15 +19,15 @@
           <w:szCs w:val="24"/>
         </w:rPr>
         <w:drawing>
-          <wp:anchor distT="0" distB="0" distL="114300" distR="114300" simplePos="0" relativeHeight="251658240" behindDoc="0" locked="0" layoutInCell="1" allowOverlap="1" wp14:anchorId="02C7E229" wp14:editId="65AA7C79">
-            <wp:simplePos x="1076325" y="1200150"/>
+          <wp:anchor distT="0" distB="0" distL="114300" distR="114300" simplePos="0" relativeHeight="251658240" behindDoc="0" locked="0" layoutInCell="1" allowOverlap="1" wp14:anchorId="02C7E229" wp14:editId="29840ED7">
+            <wp:simplePos x="0" y="0"/>
             <wp:positionH relativeFrom="margin">
-              <wp:align>center</wp:align>
+              <wp:posOffset>-180340</wp:posOffset>
             </wp:positionH>
             <wp:positionV relativeFrom="margin">
-              <wp:align>center</wp:align>
+              <wp:posOffset>-635</wp:posOffset>
             </wp:positionV>
-            <wp:extent cx="5612130" cy="7262495"/>
+            <wp:extent cx="5970270" cy="7726680"/>
             <wp:effectExtent l="0" t="0" r="0" b="0"/>
             <wp:wrapSquare wrapText="bothSides"/>
             <wp:docPr id="1411603047" name="Imagen 3" descr="Escala de tiempo&#10;&#10;Descripción generada automáticamente"/>
@@ -56,7 +56,7 @@
                   <pic:spPr>
                     <a:xfrm>
                       <a:off x="0" y="0"/>
-                      <a:ext cx="5612130" cy="7262495"/>
+                      <a:ext cx="5970270" cy="7726680"/>
                     </a:xfrm>
                     <a:prstGeom prst="rect">
                       <a:avLst/>
@@ -65,6 +65,12 @@
                 </pic:pic>
               </a:graphicData>
             </a:graphic>
+            <wp14:sizeRelH relativeFrom="margin">
+              <wp14:pctWidth>0</wp14:pctWidth>
+            </wp14:sizeRelH>
+            <wp14:sizeRelV relativeFrom="margin">
+              <wp14:pctHeight>0</wp14:pctHeight>
+            </wp14:sizeRelV>
           </wp:anchor>
         </w:drawing>
       </w:r>
@@ -402,31 +408,43 @@
         <w:jc w:val="center"/>
         <w:rPr>
           <w:rFonts w:ascii="Montserrat" w:hAnsi="Montserrat"/>
+          <w:b/>
+          <w:bCs/>
           <w:sz w:val="28"/>
           <w:szCs w:val="28"/>
-        </w:rPr>
-      </w:pPr>
-      <w:r>
-        <w:rPr>
-          <w:rFonts w:ascii="Montserrat" w:hAnsi="Montserrat"/>
+          <w:u w:val="single"/>
+        </w:rPr>
+      </w:pPr>
+      <w:r>
+        <w:rPr>
+          <w:rFonts w:ascii="Montserrat" w:hAnsi="Montserrat"/>
+          <w:b/>
+          <w:bCs/>
           <w:sz w:val="28"/>
           <w:szCs w:val="28"/>
+          <w:u w:val="single"/>
         </w:rPr>
         <w:t>Junio</w:t>
       </w:r>
       <w:r>
         <w:rPr>
           <w:rFonts w:ascii="Montserrat" w:hAnsi="Montserrat"/>
+          <w:b/>
+          <w:bCs/>
           <w:sz w:val="28"/>
           <w:szCs w:val="28"/>
+          <w:u w:val="single"/>
         </w:rPr>
         <w:t xml:space="preserve"> de 202</w:t>
       </w:r>
       <w:r>
         <w:rPr>
           <w:rFonts w:ascii="Montserrat" w:hAnsi="Montserrat"/>
+          <w:b/>
+          <w:bCs/>
           <w:sz w:val="28"/>
           <w:szCs w:val="28"/>
+          <w:u w:val="single"/>
         </w:rPr>
         <w:t>6</w:t>
       </w:r>
@@ -2348,13 +2366,23 @@
           <w:szCs w:val="20"/>
         </w:rPr>
       </w:pPr>
-      <w:r>
-        <w:rPr>
-          <w:rFonts w:ascii="Montserrat" w:hAnsi="Montserrat"/>
-          <w:sz w:val="20"/>
-          <w:szCs w:val="20"/>
-        </w:rPr>
-        <w:t xml:space="preserve">ChatBot: </w:t>
+      <w:proofErr w:type="spellStart"/>
+      <w:r>
+        <w:rPr>
+          <w:rFonts w:ascii="Montserrat" w:hAnsi="Montserrat"/>
+          <w:sz w:val="20"/>
+          <w:szCs w:val="20"/>
+        </w:rPr>
+        <w:t>ChatBot</w:t>
+      </w:r>
+      <w:proofErr w:type="spellEnd"/>
+      <w:r>
+        <w:rPr>
+          <w:rFonts w:ascii="Montserrat" w:hAnsi="Montserrat"/>
+          <w:sz w:val="20"/>
+          <w:szCs w:val="20"/>
+        </w:rPr>
+        <w:t xml:space="preserve">: </w:t>
       </w:r>
       <w:r>
         <w:rPr>
@@ -2827,14 +2855,27 @@
       <w:r>
         <w:t xml:space="preserve">Figura </w:t>
       </w:r>
-      <w:fldSimple w:instr=" SEQ Figura \* ARABIC ">
-        <w:r>
-          <w:rPr>
-            <w:noProof/>
-          </w:rPr>
-          <w:t>1</w:t>
-        </w:r>
-      </w:fldSimple>
+      <w:r>
+        <w:fldChar w:fldCharType="begin"/>
+      </w:r>
+      <w:r>
+        <w:instrText xml:space="preserve"> SEQ Figura \* ARABIC </w:instrText>
+      </w:r>
+      <w:r>
+        <w:fldChar w:fldCharType="separate"/>
+      </w:r>
+      <w:r>
+        <w:rPr>
+          <w:noProof/>
+        </w:rPr>
+        <w:t>1</w:t>
+      </w:r>
+      <w:r>
+        <w:rPr>
+          <w:noProof/>
+        </w:rPr>
+        <w:fldChar w:fldCharType="end"/>
+      </w:r>
       <w:r>
         <w:t xml:space="preserve">. </w:t>
       </w:r>
@@ -2859,6 +2900,7 @@
         </w:rPr>
         <w:t xml:space="preserve">Se planea realizar utilizar el motor de desarrollo Unity para realizar el videojuego, el cual por medio de una API desarrollada en con </w:t>
       </w:r>
+      <w:proofErr w:type="spellStart"/>
       <w:r>
         <w:rPr>
           <w:rFonts w:ascii="Montserrat" w:hAnsi="Montserrat"/>
@@ -2873,7 +2915,52 @@
           <w:sz w:val="20"/>
           <w:szCs w:val="20"/>
         </w:rPr>
-        <w:t>odeJS, se conectara a la base de datos para almacenar la información, dicha información a su vez será visible en el panel administrativo desarrollado con React, dando pie a una aplicación web, se plante el uso de una base de datos relacional en conjunto con una no relacional, para gestionar el volumen de información que se genera con los modelos de IA y el videojuego.</w:t>
+        <w:t>odeJS</w:t>
+      </w:r>
+      <w:proofErr w:type="spellEnd"/>
+      <w:r>
+        <w:rPr>
+          <w:rFonts w:ascii="Montserrat" w:hAnsi="Montserrat"/>
+          <w:sz w:val="20"/>
+          <w:szCs w:val="20"/>
+        </w:rPr>
+        <w:t xml:space="preserve">, se conectara a la base de datos para almacenar la información, dicha información a su vez será visible en el panel administrativo desarrollado con </w:t>
+      </w:r>
+      <w:proofErr w:type="spellStart"/>
+      <w:r>
+        <w:rPr>
+          <w:rFonts w:ascii="Montserrat" w:hAnsi="Montserrat"/>
+          <w:sz w:val="20"/>
+          <w:szCs w:val="20"/>
+        </w:rPr>
+        <w:t>React</w:t>
+      </w:r>
+      <w:proofErr w:type="spellEnd"/>
+      <w:r>
+        <w:rPr>
+          <w:rFonts w:ascii="Montserrat" w:hAnsi="Montserrat"/>
+          <w:sz w:val="20"/>
+          <w:szCs w:val="20"/>
+        </w:rPr>
+        <w:t xml:space="preserve">, dando pie a una aplicación web, se </w:t>
+      </w:r>
+      <w:proofErr w:type="spellStart"/>
+      <w:r>
+        <w:rPr>
+          <w:rFonts w:ascii="Montserrat" w:hAnsi="Montserrat"/>
+          <w:sz w:val="20"/>
+          <w:szCs w:val="20"/>
+        </w:rPr>
+        <w:t>plante</w:t>
+      </w:r>
+      <w:proofErr w:type="spellEnd"/>
+      <w:r>
+        <w:rPr>
+          <w:rFonts w:ascii="Montserrat" w:hAnsi="Montserrat"/>
+          <w:sz w:val="20"/>
+          <w:szCs w:val="20"/>
+        </w:rPr>
+        <w:t xml:space="preserve"> el uso de una base de datos relacional en conjunto con una no relacional, para gestionar el volumen de información que se genera con los modelos de IA y el videojuego.</w:t>
       </w:r>
     </w:p>
     <w:p>

</xml_diff>